<commit_message>
Update diagrams and templates
- Add activity diagram
- Add use case diagram
- Add DFD level 1 diagram
- Update architecture diagram (simplify layers)
- Update custom-reference.docx template

🤖 Generated with [Claude Code](https://claude.com/claude-code)

Co-Authored-By: Claude Opus 4.5 <noreply@anthropic.com>
</commit_message>
<xml_diff>
--- a/templates/custom-reference.docx
+++ b/templates/custom-reference.docx
@@ -212,7 +212,6 @@
             <w:pPr>
               <w:pStyle w:val="Compact"/>
             </w:pPr>
-            <w:bookmarkStart w:id="9" w:name="_GoBack"/>
             <w:r>
               <w:t>Table</w:t>
             </w:r>
@@ -261,7 +260,6 @@
         </w:tc>
       </w:tr>
     </w:tbl>
-    <w:bookmarkEnd w:id="9"/>
     <w:p>
       <w:pPr>
         <w:pStyle w:val="ImageCaption"/>
@@ -381,6 +379,8 @@
       <w:r>
         <w:t>Footnote Block Text</w:t>
       </w:r>
+      <w:bookmarkStart w:id="9" w:name="_GoBack"/>
+      <w:bookmarkEnd w:id="9"/>
     </w:p>
   </w:footnote>
 </w:footnotes>
@@ -569,7 +569,7 @@
   <w:abstractNum w:abstractNumId="0" w15:restartNumberingAfterBreak="0">
     <w:nsid w:val="FFFFFF7C"/>
     <w:multiLevelType w:val="singleLevel"/>
-    <w:tmpl w:val="E820B8EC"/>
+    <w:tmpl w:val="0B727CD0"/>
     <w:lvl w:ilvl="0">
       <w:start w:val="1"/>
       <w:numFmt w:val="decimal"/>
@@ -586,7 +586,7 @@
   <w:abstractNum w:abstractNumId="1" w15:restartNumberingAfterBreak="0">
     <w:nsid w:val="FFFFFF7D"/>
     <w:multiLevelType w:val="singleLevel"/>
-    <w:tmpl w:val="E744E14A"/>
+    <w:tmpl w:val="99AA8B10"/>
     <w:lvl w:ilvl="0">
       <w:start w:val="1"/>
       <w:numFmt w:val="decimal"/>
@@ -603,7 +603,7 @@
   <w:abstractNum w:abstractNumId="2" w15:restartNumberingAfterBreak="0">
     <w:nsid w:val="FFFFFF7E"/>
     <w:multiLevelType w:val="singleLevel"/>
-    <w:tmpl w:val="743CB55A"/>
+    <w:tmpl w:val="6F86E404"/>
     <w:lvl w:ilvl="0">
       <w:start w:val="1"/>
       <w:numFmt w:val="decimal"/>
@@ -620,7 +620,7 @@
   <w:abstractNum w:abstractNumId="3" w15:restartNumberingAfterBreak="0">
     <w:nsid w:val="FFFFFF7F"/>
     <w:multiLevelType w:val="singleLevel"/>
-    <w:tmpl w:val="E4E851C0"/>
+    <w:tmpl w:val="FA20577A"/>
     <w:lvl w:ilvl="0">
       <w:start w:val="1"/>
       <w:numFmt w:val="decimal"/>
@@ -637,7 +637,7 @@
   <w:abstractNum w:abstractNumId="4" w15:restartNumberingAfterBreak="0">
     <w:nsid w:val="FFFFFF80"/>
     <w:multiLevelType w:val="singleLevel"/>
-    <w:tmpl w:val="A2566776"/>
+    <w:tmpl w:val="862E066A"/>
     <w:lvl w:ilvl="0">
       <w:start w:val="1"/>
       <w:numFmt w:val="bullet"/>
@@ -657,7 +657,7 @@
   <w:abstractNum w:abstractNumId="5" w15:restartNumberingAfterBreak="0">
     <w:nsid w:val="FFFFFF81"/>
     <w:multiLevelType w:val="singleLevel"/>
-    <w:tmpl w:val="A506455E"/>
+    <w:tmpl w:val="66A07B2E"/>
     <w:lvl w:ilvl="0">
       <w:start w:val="1"/>
       <w:numFmt w:val="bullet"/>
@@ -677,7 +677,7 @@
   <w:abstractNum w:abstractNumId="6" w15:restartNumberingAfterBreak="0">
     <w:nsid w:val="FFFFFF82"/>
     <w:multiLevelType w:val="singleLevel"/>
-    <w:tmpl w:val="889AFC3E"/>
+    <w:tmpl w:val="F8D23DAA"/>
     <w:lvl w:ilvl="0">
       <w:start w:val="1"/>
       <w:numFmt w:val="bullet"/>
@@ -697,7 +697,7 @@
   <w:abstractNum w:abstractNumId="7" w15:restartNumberingAfterBreak="0">
     <w:nsid w:val="FFFFFF83"/>
     <w:multiLevelType w:val="singleLevel"/>
-    <w:tmpl w:val="6E1C8F8C"/>
+    <w:tmpl w:val="FE84906C"/>
     <w:lvl w:ilvl="0">
       <w:start w:val="1"/>
       <w:numFmt w:val="bullet"/>
@@ -717,7 +717,7 @@
   <w:abstractNum w:abstractNumId="8" w15:restartNumberingAfterBreak="0">
     <w:nsid w:val="FFFFFF88"/>
     <w:multiLevelType w:val="singleLevel"/>
-    <w:tmpl w:val="8196E94C"/>
+    <w:tmpl w:val="7AD81F14"/>
     <w:lvl w:ilvl="0">
       <w:start w:val="1"/>
       <w:numFmt w:val="decimal"/>
@@ -734,7 +734,7 @@
   <w:abstractNum w:abstractNumId="9" w15:restartNumberingAfterBreak="0">
     <w:nsid w:val="FFFFFF89"/>
     <w:multiLevelType w:val="singleLevel"/>
-    <w:tmpl w:val="7CFA196C"/>
+    <w:tmpl w:val="0988EEEE"/>
     <w:lvl w:ilvl="0">
       <w:start w:val="1"/>
       <w:numFmt w:val="bullet"/>
@@ -1814,15 +1814,19 @@
     <w:name w:val="Body Text"/>
     <w:basedOn w:val="Normal"/>
     <w:link w:val="BodyTextChar"/>
+    <w:autoRedefine/>
     <w:qFormat/>
+    <w:rsid w:val="003E6BBB"/>
     <w:pPr>
       <w:spacing w:before="180" w:after="180"/>
+      <w:jc w:val="both"/>
     </w:pPr>
   </w:style>
   <w:style w:type="paragraph" w:customStyle="1" w:styleId="FirstParagraph">
     <w:name w:val="First Paragraph"/>
     <w:basedOn w:val="BodyText"/>
     <w:next w:val="BodyText"/>
+    <w:autoRedefine/>
     <w:qFormat/>
   </w:style>
   <w:style w:type="paragraph" w:customStyle="1" w:styleId="Compact">
@@ -2750,7 +2754,29 @@
     <w:name w:val="Body Text Char"/>
     <w:basedOn w:val="DefaultParagraphFont"/>
     <w:link w:val="BodyText"/>
-    <w:rsid w:val="006E4100"/>
+    <w:rsid w:val="003E6BBB"/>
+    <w:rPr>
+      <w:rFonts w:ascii="Times" w:eastAsia="Times New Roman" w:hAnsi="Times" w:cs="Times New Roman"/>
+      <w:szCs w:val="20"/>
+      <w:lang w:eastAsia="en-US"/>
+    </w:rPr>
+  </w:style>
+  <w:style w:type="paragraph" w:styleId="BodyText2">
+    <w:name w:val="Body Text 2"/>
+    <w:basedOn w:val="Normal"/>
+    <w:link w:val="BodyText2Char"/>
+    <w:autoRedefine/>
+    <w:rsid w:val="003E6BBB"/>
+    <w:pPr>
+      <w:spacing w:after="120" w:line="480" w:lineRule="auto"/>
+      <w:jc w:val="both"/>
+    </w:pPr>
+  </w:style>
+  <w:style w:type="character" w:customStyle="1" w:styleId="BodyText2Char">
+    <w:name w:val="Body Text 2 Char"/>
+    <w:basedOn w:val="DefaultParagraphFont"/>
+    <w:link w:val="BodyText2"/>
+    <w:rsid w:val="003E6BBB"/>
     <w:rPr>
       <w:rFonts w:ascii="Times" w:eastAsia="Times New Roman" w:hAnsi="Times" w:cs="Times New Roman"/>
       <w:szCs w:val="20"/>

</xml_diff>

<commit_message>
Give headings space below them, not just above
The SCET template sets every heading style to w:after="0", so a heading sat
directly on top of the first line of the paragraph under it. The 1.5 line
spacing made the result look squashed.

Set both sides for all four levels, in twips: Heading 1 480/240,
Heading 2 360/180, Heading 3 300/150, Heading 4 120/240. The before values
for Heading 2 and 3 were also raised from 200, which was tight against the
preceding paragraph at 1.5 spacing.

This lives in build-reference.sh beside the existing heading-size patch, so
regenerating the reference doc keeps it instead of reverting to the
template's zeros.

Report grows from 82 to 87 pages. List of Figures and List of Tables page
numbers re-verified against the rendered pages after the reflow.

Co-Authored-By: Claude Opus 5 (1M context) <noreply@anthropic.com>
Claude-Session: https://claude.ai/code/session_01UDTrdxCEPjLfskJojoQbtq
</commit_message>
<xml_diff>
--- a/templates/custom-reference.docx
+++ b/templates/custom-reference.docx
@@ -2026,7 +2026,7 @@
     <w:pPr>
       <w:keepNext/>
       <w:keepLines/>
-      <w:spacing w:after="0" w:before="480"/>
+      <w:spacing w:before="480" w:after="240"/>
       <w:outlineLvl w:val="0"/>
     </w:pPr>
     <w:rPr>
@@ -2049,7 +2049,7 @@
     <w:pPr>
       <w:keepNext/>
       <w:keepLines/>
-      <w:spacing w:after="0" w:before="200"/>
+      <w:spacing w:before="360" w:after="180"/>
       <w:outlineLvl w:val="1"/>
     </w:pPr>
     <w:rPr>
@@ -2072,7 +2072,7 @@
     <w:pPr>
       <w:keepNext/>
       <w:keepLines/>
-      <w:spacing w:after="0" w:before="200"/>
+      <w:spacing w:before="300" w:after="150"/>
       <w:outlineLvl w:val="2"/>
     </w:pPr>
     <w:rPr>
@@ -2096,7 +2096,7 @@
     <w:pPr>
       <w:keepNext/>
       <w:keepLines/>
-      <w:spacing w:after="0" w:before="200"/>
+      <w:spacing w:before="240" w:after="120"/>
       <w:outlineLvl w:val="3"/>
     </w:pPr>
     <w:rPr>

</xml_diff>